<commit_message>
Document white-label survey links
Co-authored-by: paladuguraj <paladuguraj@users.noreply.github.com>
</commit_message>
<xml_diff>
--- a/docs/CSAT Survey Portal - Functional Requirements and Test Report.docx
+++ b/docs/CSAT Survey Portal - Functional Requirements and Test Report.docx
@@ -28,7 +28,7 @@
         </w:p>
       </w:sdtContent>
     </w:sdt>
-    <w:bookmarkStart w:id="37" w:name="X5b5e0d4201f25ea5647317961a6b8e350744058"/>
+    <w:bookmarkStart w:id="38" w:name="X5b5e0d4201f25ea5647317961a6b8e350744058"/>
     <w:p>
       <w:pPr>
         <w:pStyle w:val="Heading1"/>
@@ -1192,6 +1192,98 @@
           </w:p>
         </w:tc>
       </w:tr>
+      <w:tr>
+        <w:tc>
+          <w:tcPr/>
+          <w:p>
+            <w:pPr>
+              <w:pStyle w:val="Compact"/>
+              <w:jc w:val="left"/>
+            </w:pPr>
+            <w:r>
+              <w:t xml:space="preserve">FR-22</w:t>
+            </w:r>
+          </w:p>
+        </w:tc>
+        <w:tc>
+          <w:tcPr/>
+          <w:p>
+            <w:pPr>
+              <w:pStyle w:val="Compact"/>
+              <w:jc w:val="left"/>
+            </w:pPr>
+            <w:r>
+              <w:t xml:space="preserve">Recipients of a</w:t>
+            </w:r>
+            <w:r>
+              <w:t xml:space="preserve"> </w:t>
+            </w:r>
+            <w:r>
+              <w:rPr>
+                <w:bCs/>
+                <w:b/>
+              </w:rPr>
+              <w:t xml:space="preserve">white-label partner</w:t>
+            </w:r>
+            <w:r>
+              <w:t xml:space="preserve"> </w:t>
+            </w:r>
+            <w:r>
+              <w:t xml:space="preserve">receive the survey link on that partner’s own domain</w:t>
+            </w:r>
+          </w:p>
+        </w:tc>
+        <w:tc>
+          <w:tcPr/>
+          <w:p>
+            <w:pPr>
+              <w:pStyle w:val="Compact"/>
+              <w:jc w:val="left"/>
+            </w:pPr>
+            <w:r>
+              <w:t xml:space="preserve">Met</w:t>
+            </w:r>
+          </w:p>
+        </w:tc>
+      </w:tr>
+      <w:tr>
+        <w:tc>
+          <w:tcPr/>
+          <w:p>
+            <w:pPr>
+              <w:pStyle w:val="Compact"/>
+              <w:jc w:val="left"/>
+            </w:pPr>
+            <w:r>
+              <w:t xml:space="preserve">FR-23</w:t>
+            </w:r>
+          </w:p>
+        </w:tc>
+        <w:tc>
+          <w:tcPr/>
+          <w:p>
+            <w:pPr>
+              <w:pStyle w:val="Compact"/>
+              <w:jc w:val="left"/>
+            </w:pPr>
+            <w:r>
+              <w:t xml:space="preserve">Everyone else receives the link on the instance’s own address</w:t>
+            </w:r>
+          </w:p>
+        </w:tc>
+        <w:tc>
+          <w:tcPr/>
+          <w:p>
+            <w:pPr>
+              <w:pStyle w:val="Compact"/>
+              <w:jc w:val="left"/>
+            </w:pPr>
+            <w:r>
+              <w:t xml:space="preserve">Met</w:t>
+            </w:r>
+          </w:p>
+        </w:tc>
+      </w:tr>
     </w:tbl>
     <w:bookmarkStart w:id="21" w:name="business-rules-in-plain-terms"/>
     <w:p>
@@ -1341,6 +1433,63 @@
       </w:r>
     </w:p>
     <w:p>
+      <w:pPr>
+        <w:pStyle w:val="BodyText"/>
+      </w:pPr>
+      <w:r>
+        <w:rPr>
+          <w:bCs/>
+          <w:b/>
+        </w:rPr>
+        <w:t xml:space="preserve">Which address the survey link uses.</w:t>
+      </w:r>
+      <w:r>
+        <w:t xml:space="preserve"> </w:t>
+      </w:r>
+      <w:r>
+        <w:t xml:space="preserve">Partners who resell the service under</w:t>
+      </w:r>
+      <w:r>
+        <w:t xml:space="preserve"> </w:t>
+      </w:r>
+      <w:r>
+        <w:t xml:space="preserve">their own brand have their own domain, listed in the</w:t>
+      </w:r>
+      <w:r>
+        <w:t xml:space="preserve"> </w:t>
+      </w:r>
+      <w:r>
+        <w:rPr>
+          <w:rStyle w:val="VerbatimChar"/>
+        </w:rPr>
+        <w:t xml:space="preserve">survey.link.whitelabel</w:t>
+      </w:r>
+      <w:r>
+        <w:t xml:space="preserve"> </w:t>
+      </w:r>
+      <w:r>
+        <w:t xml:space="preserve">property. A customer inherits the domain of the partner their account sits</w:t>
+      </w:r>
+      <w:r>
+        <w:t xml:space="preserve"> </w:t>
+      </w:r>
+      <w:r>
+        <w:t xml:space="preserve">under, so they only ever see their own provider’s address. Customers who are not</w:t>
+      </w:r>
+      <w:r>
+        <w:t xml:space="preserve"> </w:t>
+      </w:r>
+      <w:r>
+        <w:t xml:space="preserve">behind a partner get the standard address. The survey page itself is the same</w:t>
+      </w:r>
+      <w:r>
+        <w:t xml:space="preserve"> </w:t>
+      </w:r>
+      <w:r>
+        <w:t xml:space="preserve">for everyone.</w:t>
+      </w:r>
+    </w:p>
+    <w:p>
       <w:r>
         <w:pict>
           <v:rect style="width:0;height:1.5pt" o:hralign="center" o:hrstd="t" o:hr="t"/>
@@ -1478,7 +1627,7 @@
       </w:r>
     </w:p>
     <w:bookmarkEnd w:id="23"/>
-    <w:bookmarkStart w:id="29" w:name="test-report"/>
+    <w:bookmarkStart w:id="30" w:name="test-report"/>
     <w:p>
       <w:pPr>
         <w:pStyle w:val="Heading2"/>
@@ -3021,282 +3170,27 @@
       </w:tr>
     </w:tbl>
     <w:bookmarkEnd w:id="26"/>
-    <w:bookmarkStart w:id="27" w:name="rules-proven-with-live-data"/>
+    <w:bookmarkStart w:id="27" w:name="b-white-label-survey-links-passed"/>
     <w:p>
       <w:pPr>
         <w:pStyle w:val="Heading3"/>
       </w:pPr>
       <w:r>
-        <w:t xml:space="preserve">4.3 Rules proven with live data</w:t>
-      </w:r>
-    </w:p>
-    <w:tbl>
-      <w:tblPr>
-        <w:tblStyle w:val="Table"/>
-        <w:tblW w:type="pct" w:w="5000"/>
-        <w:tblLook w:firstRow="1" w:lastRow="0" w:firstColumn="0" w:lastColumn="0" w:noHBand="0" w:noVBand="0" w:val="0020"/>
-        <w:jc w:val="start"/>
-      </w:tblPr>
-      <w:tblGrid>
-        <w:gridCol w:w="3960"/>
-        <w:gridCol w:w="3960"/>
-      </w:tblGrid>
-      <w:tr>
-        <w:trPr>
-          <w:tblHeader w:val="true"/>
-        </w:trPr>
-        <w:tc>
-          <w:tcPr/>
-          <w:p>
-            <w:pPr>
-              <w:pStyle w:val="Compact"/>
-              <w:jc w:val="left"/>
-            </w:pPr>
-            <w:r>
-              <w:t xml:space="preserve">Scenario</w:t>
-            </w:r>
-          </w:p>
-        </w:tc>
-        <w:tc>
-          <w:tcPr/>
-          <w:p>
-            <w:pPr>
-              <w:pStyle w:val="Compact"/>
-              <w:jc w:val="left"/>
-            </w:pPr>
-            <w:r>
-              <w:t xml:space="preserve">Result</w:t>
-            </w:r>
-          </w:p>
-        </w:tc>
-      </w:tr>
-      <w:tr>
-        <w:tc>
-          <w:tcPr/>
-          <w:p>
-            <w:pPr>
-              <w:pStyle w:val="Compact"/>
-              <w:jc w:val="left"/>
-            </w:pPr>
-            <w:r>
-              <w:t xml:space="preserve">First survey to a new recipient</w:t>
-            </w:r>
-          </w:p>
-        </w:tc>
-        <w:tc>
-          <w:tcPr/>
-          <w:p>
-            <w:pPr>
-              <w:pStyle w:val="Compact"/>
-              <w:jc w:val="left"/>
-            </w:pPr>
-            <w:r>
-              <w:t xml:space="preserve">Sent, assessment instance created, invitation queued</w:t>
-            </w:r>
-          </w:p>
-        </w:tc>
-      </w:tr>
-      <w:tr>
-        <w:tc>
-          <w:tcPr/>
-          <w:p>
-            <w:pPr>
-              <w:pStyle w:val="Compact"/>
-              <w:jc w:val="left"/>
-            </w:pPr>
-            <w:r>
-              <w:t xml:space="preserve">Same recipient again immediately</w:t>
-            </w:r>
-          </w:p>
-        </w:tc>
-        <w:tc>
-          <w:tcPr/>
-          <w:p>
-            <w:pPr>
-              <w:pStyle w:val="Compact"/>
-              <w:jc w:val="left"/>
-            </w:pPr>
-            <w:r>
-              <w:rPr>
-                <w:bCs/>
-                <w:b/>
-              </w:rPr>
-              <w:t xml:space="preserve">Blocked</w:t>
-            </w:r>
-            <w:r>
-              <w:t xml:space="preserve"> </w:t>
-            </w:r>
-            <w:r>
-              <w:t xml:space="preserve">—</w:t>
-            </w:r>
-            <w:r>
-              <w:t xml:space="preserve"> </w:t>
-            </w:r>
-            <w:r>
-              <w:t xml:space="preserve">“</w:t>
-            </w:r>
-            <w:r>
-              <w:t xml:space="preserve">Surveyed on 2026-08-01 09:13:50. Eligible again in 90 day(s).</w:t>
-            </w:r>
-            <w:r>
-              <w:t xml:space="preserve">”</w:t>
-            </w:r>
-          </w:p>
-        </w:tc>
-      </w:tr>
-      <w:tr>
-        <w:tc>
-          <w:tcPr/>
-          <w:p>
-            <w:pPr>
-              <w:pStyle w:val="Compact"/>
-              <w:jc w:val="left"/>
-            </w:pPr>
-            <w:r>
-              <w:t xml:space="preserve">Draft survey attempted</w:t>
-            </w:r>
-          </w:p>
-        </w:tc>
-        <w:tc>
-          <w:tcPr/>
-          <w:p>
-            <w:pPr>
-              <w:pStyle w:val="Compact"/>
-              <w:jc w:val="left"/>
-            </w:pPr>
-            <w:r>
-              <w:rPr>
-                <w:bCs/>
-                <w:b/>
-              </w:rPr>
-              <w:t xml:space="preserve">Blocked</w:t>
-            </w:r>
-            <w:r>
-              <w:t xml:space="preserve"> </w:t>
-            </w:r>
-            <w:r>
-              <w:t xml:space="preserve">—</w:t>
-            </w:r>
-            <w:r>
-              <w:t xml:space="preserve"> </w:t>
-            </w:r>
-            <w:r>
-              <w:t xml:space="preserve">“</w:t>
-            </w:r>
-            <w:r>
-              <w:t xml:space="preserve">Survey</w:t>
-            </w:r>
-            <w:r>
-              <w:t xml:space="preserve"> </w:t>
-            </w:r>
-            <w:r>
-              <w:t xml:space="preserve">‘</w:t>
-            </w:r>
-            <w:r>
-              <w:t xml:space="preserve">Complex Resolution Survey</w:t>
-            </w:r>
-            <w:r>
-              <w:t xml:space="preserve">’</w:t>
-            </w:r>
-            <w:r>
-              <w:t xml:space="preserve"> </w:t>
-            </w:r>
-            <w:r>
-              <w:t xml:space="preserve">is still in Draft. Publish it in Survey Designer before sending.</w:t>
-            </w:r>
-            <w:r>
-              <w:t xml:space="preserve">”</w:t>
-            </w:r>
-          </w:p>
-        </w:tc>
-      </w:tr>
-      <w:tr>
-        <w:tc>
-          <w:tcPr/>
-          <w:p>
-            <w:pPr>
-              <w:pStyle w:val="Compact"/>
-              <w:jc w:val="left"/>
-            </w:pPr>
-            <w:r>
-              <w:t xml:space="preserve">Published survey to a Primary User</w:t>
-            </w:r>
-          </w:p>
-        </w:tc>
-        <w:tc>
-          <w:tcPr/>
-          <w:p>
-            <w:pPr>
-              <w:pStyle w:val="Compact"/>
-              <w:jc w:val="left"/>
-            </w:pPr>
-            <w:r>
-              <w:t xml:space="preserve">Sent — instance created, invitation queued</w:t>
-            </w:r>
-          </w:p>
-        </w:tc>
-      </w:tr>
-      <w:tr>
-        <w:tc>
-          <w:tcPr/>
-          <w:p>
-            <w:pPr>
-              <w:pStyle w:val="Compact"/>
-              <w:jc w:val="left"/>
-            </w:pPr>
-            <w:r>
-              <w:t xml:space="preserve">Selecting 2 of 28 users</w:t>
-            </w:r>
-          </w:p>
-        </w:tc>
-        <w:tc>
-          <w:tcPr/>
-          <w:p>
-            <w:pPr>
-              <w:pStyle w:val="Compact"/>
-              <w:jc w:val="left"/>
-            </w:pPr>
-            <w:r>
-              <w:t xml:space="preserve">Exactly 2 recipients, confirmed in the audit table</w:t>
-            </w:r>
-          </w:p>
-        </w:tc>
-      </w:tr>
-      <w:tr>
-        <w:tc>
-          <w:tcPr/>
-          <w:p>
-            <w:pPr>
-              <w:pStyle w:val="Compact"/>
-              <w:jc w:val="left"/>
-            </w:pPr>
-            <w:r>
-              <w:t xml:space="preserve">Filtering the picker</w:t>
-            </w:r>
-          </w:p>
-        </w:tc>
-        <w:tc>
-          <w:tcPr/>
-          <w:p>
-            <w:pPr>
-              <w:pStyle w:val="Compact"/>
-              <w:jc w:val="left"/>
-            </w:pPr>
-            <w:r>
-              <w:t xml:space="preserve">28 narrowed to 1; only that person received it</w:t>
-            </w:r>
-          </w:p>
-        </w:tc>
-      </w:tr>
-    </w:tbl>
-    <w:bookmarkEnd w:id="27"/>
-    <w:bookmarkStart w:id="28" w:name="defects-found-and-resolved-during-build"/>
-    <w:p>
-      <w:pPr>
-        <w:pStyle w:val="Heading3"/>
-      </w:pPr>
-      <w:r>
-        <w:t xml:space="preserve">4.4 Defects found and resolved during build</w:t>
+        <w:t xml:space="preserve">4.2b White-label survey links — passed</w:t>
+      </w:r>
+    </w:p>
+    <w:p>
+      <w:pPr>
+        <w:pStyle w:val="FirstParagraph"/>
+      </w:pPr>
+      <w:r>
+        <w:t xml:space="preserve">Every account surveyed to date resolved to its partner’s domain, checked by</w:t>
+      </w:r>
+      <w:r>
+        <w:t xml:space="preserve"> </w:t>
+      </w:r>
+      <w:r>
+        <w:t xml:space="preserve">rendering the invitation mail script itself rather than the resolver alone:</w:t>
       </w:r>
     </w:p>
     <w:tbl>
@@ -3323,6 +3217,746 @@
               <w:jc w:val="left"/>
             </w:pPr>
             <w:r>
+              <w:t xml:space="preserve">Account</w:t>
+            </w:r>
+          </w:p>
+        </w:tc>
+        <w:tc>
+          <w:tcPr/>
+          <w:p>
+            <w:pPr>
+              <w:pStyle w:val="Compact"/>
+              <w:jc w:val="left"/>
+            </w:pPr>
+            <w:r>
+              <w:t xml:space="preserve">Partner</w:t>
+            </w:r>
+          </w:p>
+        </w:tc>
+        <w:tc>
+          <w:tcPr/>
+          <w:p>
+            <w:pPr>
+              <w:pStyle w:val="Compact"/>
+              <w:jc w:val="left"/>
+            </w:pPr>
+            <w:r>
+              <w:t xml:space="preserve">Link host</w:t>
+            </w:r>
+          </w:p>
+        </w:tc>
+      </w:tr>
+      <w:tr>
+        <w:tc>
+          <w:tcPr/>
+          <w:p>
+            <w:pPr>
+              <w:pStyle w:val="Compact"/>
+              <w:jc w:val="left"/>
+            </w:pPr>
+            <w:r>
+              <w:t xml:space="preserve">ADCom (Corporate Account)</w:t>
+            </w:r>
+          </w:p>
+        </w:tc>
+        <w:tc>
+          <w:tcPr/>
+          <w:p>
+            <w:pPr>
+              <w:pStyle w:val="Compact"/>
+              <w:jc w:val="left"/>
+            </w:pPr>
+            <w:r>
+              <w:t xml:space="preserve">Direct</w:t>
+            </w:r>
+          </w:p>
+        </w:tc>
+        <w:tc>
+          <w:tcPr/>
+          <w:p>
+            <w:pPr>
+              <w:pStyle w:val="Compact"/>
+              <w:jc w:val="left"/>
+            </w:pPr>
+            <w:r>
+              <w:rPr>
+                <w:rStyle w:val="VerbatimChar"/>
+              </w:rPr>
+              <w:t xml:space="preserve">nocportal.appdirect.com</w:t>
+            </w:r>
+          </w:p>
+        </w:tc>
+      </w:tr>
+      <w:tr>
+        <w:tc>
+          <w:tcPr/>
+          <w:p>
+            <w:pPr>
+              <w:pStyle w:val="Compact"/>
+              <w:jc w:val="left"/>
+            </w:pPr>
+            <w:r>
+              <w:t xml:space="preserve">Vector-DTLR Inc</w:t>
+            </w:r>
+          </w:p>
+        </w:tc>
+        <w:tc>
+          <w:tcPr/>
+          <w:p>
+            <w:pPr>
+              <w:pStyle w:val="Compact"/>
+              <w:jc w:val="left"/>
+            </w:pPr>
+            <w:r>
+              <w:t xml:space="preserve">Vector Security Networks</w:t>
+            </w:r>
+          </w:p>
+        </w:tc>
+        <w:tc>
+          <w:tcPr/>
+          <w:p>
+            <w:pPr>
+              <w:pStyle w:val="Compact"/>
+              <w:jc w:val="left"/>
+            </w:pPr>
+            <w:r>
+              <w:rPr>
+                <w:rStyle w:val="VerbatimChar"/>
+              </w:rPr>
+              <w:t xml:space="preserve">vsnnoc247.vectorsecurity.com</w:t>
+            </w:r>
+          </w:p>
+        </w:tc>
+      </w:tr>
+      <w:tr>
+        <w:tc>
+          <w:tcPr/>
+          <w:p>
+            <w:pPr>
+              <w:pStyle w:val="Compact"/>
+              <w:jc w:val="left"/>
+            </w:pPr>
+            <w:r>
+              <w:t xml:space="preserve">Vector-Floyds Barbershop</w:t>
+            </w:r>
+          </w:p>
+        </w:tc>
+        <w:tc>
+          <w:tcPr/>
+          <w:p>
+            <w:pPr>
+              <w:pStyle w:val="Compact"/>
+              <w:jc w:val="left"/>
+            </w:pPr>
+            <w:r>
+              <w:t xml:space="preserve">Vector Security Networks</w:t>
+            </w:r>
+          </w:p>
+        </w:tc>
+        <w:tc>
+          <w:tcPr/>
+          <w:p>
+            <w:pPr>
+              <w:pStyle w:val="Compact"/>
+              <w:jc w:val="left"/>
+            </w:pPr>
+            <w:r>
+              <w:rPr>
+                <w:rStyle w:val="VerbatimChar"/>
+              </w:rPr>
+              <w:t xml:space="preserve">vsnnoc247.vectorsecurity.com</w:t>
+            </w:r>
+          </w:p>
+        </w:tc>
+      </w:tr>
+      <w:tr>
+        <w:tc>
+          <w:tcPr/>
+          <w:p>
+            <w:pPr>
+              <w:pStyle w:val="Compact"/>
+              <w:jc w:val="left"/>
+            </w:pPr>
+            <w:r>
+              <w:t xml:space="preserve">1419 Clark County Credit Union</w:t>
+            </w:r>
+          </w:p>
+        </w:tc>
+        <w:tc>
+          <w:tcPr/>
+          <w:p>
+            <w:pPr>
+              <w:pStyle w:val="Compact"/>
+              <w:jc w:val="left"/>
+            </w:pPr>
+            <w:r>
+              <w:t xml:space="preserve">Fiserv</w:t>
+            </w:r>
+          </w:p>
+        </w:tc>
+        <w:tc>
+          <w:tcPr/>
+          <w:p>
+            <w:pPr>
+              <w:pStyle w:val="Compact"/>
+              <w:jc w:val="left"/>
+            </w:pPr>
+            <w:r>
+              <w:rPr>
+                <w:rStyle w:val="VerbatimChar"/>
+              </w:rPr>
+              <w:t xml:space="preserve">nocportal.appdirect.com</w:t>
+            </w:r>
+          </w:p>
+        </w:tc>
+      </w:tr>
+      <w:tr>
+        <w:tc>
+          <w:tcPr/>
+          <w:p>
+            <w:pPr>
+              <w:pStyle w:val="Compact"/>
+              <w:jc w:val="left"/>
+            </w:pPr>
+            <w:r>
+              <w:t xml:space="preserve">Henry Ford Health System</w:t>
+            </w:r>
+          </w:p>
+        </w:tc>
+        <w:tc>
+          <w:tcPr/>
+          <w:p>
+            <w:pPr>
+              <w:pStyle w:val="Compact"/>
+              <w:jc w:val="left"/>
+            </w:pPr>
+            <w:r>
+              <w:t xml:space="preserve">ATT TAO Partner</w:t>
+            </w:r>
+          </w:p>
+        </w:tc>
+        <w:tc>
+          <w:tcPr/>
+          <w:p>
+            <w:pPr>
+              <w:pStyle w:val="Compact"/>
+              <w:jc w:val="left"/>
+            </w:pPr>
+            <w:r>
+              <w:rPr>
+                <w:rStyle w:val="VerbatimChar"/>
+              </w:rPr>
+              <w:t xml:space="preserve">portal.tao.attniglobal.com</w:t>
+            </w:r>
+          </w:p>
+        </w:tc>
+      </w:tr>
+      <w:tr>
+        <w:tc>
+          <w:tcPr/>
+          <w:p>
+            <w:pPr>
+              <w:pStyle w:val="Compact"/>
+              <w:jc w:val="left"/>
+            </w:pPr>
+            <w:r>
+              <w:t xml:space="preserve">AppDIrect - 10512</w:t>
+            </w:r>
+          </w:p>
+        </w:tc>
+        <w:tc>
+          <w:tcPr/>
+          <w:p>
+            <w:pPr>
+              <w:pStyle w:val="Compact"/>
+              <w:jc w:val="left"/>
+            </w:pPr>
+            <w:r>
+              <w:t xml:space="preserve">APX Net</w:t>
+            </w:r>
+          </w:p>
+        </w:tc>
+        <w:tc>
+          <w:tcPr/>
+          <w:p>
+            <w:pPr>
+              <w:pStyle w:val="Compact"/>
+              <w:jc w:val="left"/>
+            </w:pPr>
+            <w:r>
+              <w:rPr>
+                <w:rStyle w:val="VerbatimChar"/>
+              </w:rPr>
+              <w:t xml:space="preserve">portal.apxnet.com</w:t>
+            </w:r>
+          </w:p>
+        </w:tc>
+      </w:tr>
+    </w:tbl>
+    <w:p>
+      <w:pPr>
+        <w:pStyle w:val="BodyText"/>
+      </w:pPr>
+      <w:r>
+        <w:t xml:space="preserve">Fallbacks, each confirmed to return the instance address:</w:t>
+      </w:r>
+    </w:p>
+    <w:tbl>
+      <w:tblPr>
+        <w:tblStyle w:val="Table"/>
+        <w:tblW w:type="auto" w:w="0"/>
+        <w:tblLook w:firstRow="1" w:lastRow="0" w:firstColumn="0" w:lastColumn="0" w:noHBand="0" w:noVBand="0" w:val="0020"/>
+        <w:jc w:val="start"/>
+      </w:tblPr>
+      <w:tblGrid>
+        <w:gridCol w:w="3960"/>
+        <w:gridCol w:w="3960"/>
+      </w:tblGrid>
+      <w:tr>
+        <w:trPr>
+          <w:tblHeader w:val="true"/>
+        </w:trPr>
+        <w:tc>
+          <w:tcPr/>
+          <w:p>
+            <w:pPr>
+              <w:pStyle w:val="Compact"/>
+              <w:jc w:val="left"/>
+            </w:pPr>
+            <w:r>
+              <w:t xml:space="preserve">Condition</w:t>
+            </w:r>
+          </w:p>
+        </w:tc>
+        <w:tc>
+          <w:tcPr/>
+          <w:p>
+            <w:pPr>
+              <w:pStyle w:val="Compact"/>
+              <w:jc w:val="left"/>
+            </w:pPr>
+            <w:r>
+              <w:t xml:space="preserve">Result</w:t>
+            </w:r>
+          </w:p>
+        </w:tc>
+      </w:tr>
+      <w:tr>
+        <w:tc>
+          <w:tcPr/>
+          <w:p>
+            <w:pPr>
+              <w:pStyle w:val="Compact"/>
+              <w:jc w:val="left"/>
+            </w:pPr>
+            <w:r>
+              <w:t xml:space="preserve">Account not behind a white-label partner</w:t>
+            </w:r>
+          </w:p>
+        </w:tc>
+        <w:tc>
+          <w:tcPr/>
+          <w:p>
+            <w:pPr>
+              <w:pStyle w:val="Compact"/>
+              <w:jc w:val="left"/>
+            </w:pPr>
+            <w:r>
+              <w:t xml:space="preserve">Instance address</w:t>
+            </w:r>
+          </w:p>
+        </w:tc>
+      </w:tr>
+      <w:tr>
+        <w:tc>
+          <w:tcPr/>
+          <w:p>
+            <w:pPr>
+              <w:pStyle w:val="Compact"/>
+              <w:jc w:val="left"/>
+            </w:pPr>
+            <w:r>
+              <w:t xml:space="preserve">Property not set or empty</w:t>
+            </w:r>
+          </w:p>
+        </w:tc>
+        <w:tc>
+          <w:tcPr/>
+          <w:p>
+            <w:pPr>
+              <w:pStyle w:val="Compact"/>
+              <w:jc w:val="left"/>
+            </w:pPr>
+            <w:r>
+              <w:t xml:space="preserve">Instance address</w:t>
+            </w:r>
+          </w:p>
+        </w:tc>
+      </w:tr>
+      <w:tr>
+        <w:tc>
+          <w:tcPr/>
+          <w:p>
+            <w:pPr>
+              <w:pStyle w:val="Compact"/>
+              <w:jc w:val="left"/>
+            </w:pPr>
+            <w:r>
+              <w:t xml:space="preserve">Property contains malformed JSON</w:t>
+            </w:r>
+          </w:p>
+        </w:tc>
+        <w:tc>
+          <w:tcPr/>
+          <w:p>
+            <w:pPr>
+              <w:pStyle w:val="Compact"/>
+              <w:jc w:val="left"/>
+            </w:pPr>
+            <w:r>
+              <w:t xml:space="preserve">Instance address, warning logged</w:t>
+            </w:r>
+          </w:p>
+        </w:tc>
+      </w:tr>
+      <w:tr>
+        <w:tc>
+          <w:tcPr/>
+          <w:p>
+            <w:pPr>
+              <w:pStyle w:val="Compact"/>
+              <w:jc w:val="left"/>
+            </w:pPr>
+            <w:r>
+              <w:t xml:space="preserve">Request has no account</w:t>
+            </w:r>
+          </w:p>
+        </w:tc>
+        <w:tc>
+          <w:tcPr/>
+          <w:p>
+            <w:pPr>
+              <w:pStyle w:val="Compact"/>
+              <w:jc w:val="left"/>
+            </w:pPr>
+            <w:r>
+              <w:t xml:space="preserve">Instance address</w:t>
+            </w:r>
+          </w:p>
+        </w:tc>
+      </w:tr>
+    </w:tbl>
+    <w:p>
+      <w:pPr>
+        <w:pStyle w:val="BodyText"/>
+      </w:pPr>
+      <w:r>
+        <w:t xml:space="preserve">Case-triggered surveys were re-checked and are unchanged.</w:t>
+      </w:r>
+    </w:p>
+    <w:bookmarkEnd w:id="27"/>
+    <w:bookmarkStart w:id="28" w:name="rules-proven-with-live-data"/>
+    <w:p>
+      <w:pPr>
+        <w:pStyle w:val="Heading3"/>
+      </w:pPr>
+      <w:r>
+        <w:t xml:space="preserve">4.3 Rules proven with live data</w:t>
+      </w:r>
+    </w:p>
+    <w:tbl>
+      <w:tblPr>
+        <w:tblStyle w:val="Table"/>
+        <w:tblW w:type="pct" w:w="5000"/>
+        <w:tblLook w:firstRow="1" w:lastRow="0" w:firstColumn="0" w:lastColumn="0" w:noHBand="0" w:noVBand="0" w:val="0020"/>
+        <w:jc w:val="start"/>
+      </w:tblPr>
+      <w:tblGrid>
+        <w:gridCol w:w="3960"/>
+        <w:gridCol w:w="3960"/>
+      </w:tblGrid>
+      <w:tr>
+        <w:trPr>
+          <w:tblHeader w:val="true"/>
+        </w:trPr>
+        <w:tc>
+          <w:tcPr/>
+          <w:p>
+            <w:pPr>
+              <w:pStyle w:val="Compact"/>
+              <w:jc w:val="left"/>
+            </w:pPr>
+            <w:r>
+              <w:t xml:space="preserve">Scenario</w:t>
+            </w:r>
+          </w:p>
+        </w:tc>
+        <w:tc>
+          <w:tcPr/>
+          <w:p>
+            <w:pPr>
+              <w:pStyle w:val="Compact"/>
+              <w:jc w:val="left"/>
+            </w:pPr>
+            <w:r>
+              <w:t xml:space="preserve">Result</w:t>
+            </w:r>
+          </w:p>
+        </w:tc>
+      </w:tr>
+      <w:tr>
+        <w:tc>
+          <w:tcPr/>
+          <w:p>
+            <w:pPr>
+              <w:pStyle w:val="Compact"/>
+              <w:jc w:val="left"/>
+            </w:pPr>
+            <w:r>
+              <w:t xml:space="preserve">First survey to a new recipient</w:t>
+            </w:r>
+          </w:p>
+        </w:tc>
+        <w:tc>
+          <w:tcPr/>
+          <w:p>
+            <w:pPr>
+              <w:pStyle w:val="Compact"/>
+              <w:jc w:val="left"/>
+            </w:pPr>
+            <w:r>
+              <w:t xml:space="preserve">Sent, assessment instance created, invitation queued</w:t>
+            </w:r>
+          </w:p>
+        </w:tc>
+      </w:tr>
+      <w:tr>
+        <w:tc>
+          <w:tcPr/>
+          <w:p>
+            <w:pPr>
+              <w:pStyle w:val="Compact"/>
+              <w:jc w:val="left"/>
+            </w:pPr>
+            <w:r>
+              <w:t xml:space="preserve">Same recipient again immediately</w:t>
+            </w:r>
+          </w:p>
+        </w:tc>
+        <w:tc>
+          <w:tcPr/>
+          <w:p>
+            <w:pPr>
+              <w:pStyle w:val="Compact"/>
+              <w:jc w:val="left"/>
+            </w:pPr>
+            <w:r>
+              <w:rPr>
+                <w:bCs/>
+                <w:b/>
+              </w:rPr>
+              <w:t xml:space="preserve">Blocked</w:t>
+            </w:r>
+            <w:r>
+              <w:t xml:space="preserve"> </w:t>
+            </w:r>
+            <w:r>
+              <w:t xml:space="preserve">—</w:t>
+            </w:r>
+            <w:r>
+              <w:t xml:space="preserve"> </w:t>
+            </w:r>
+            <w:r>
+              <w:t xml:space="preserve">“</w:t>
+            </w:r>
+            <w:r>
+              <w:t xml:space="preserve">Surveyed on 2026-08-01 09:13:50. Eligible again in 90 day(s).</w:t>
+            </w:r>
+            <w:r>
+              <w:t xml:space="preserve">”</w:t>
+            </w:r>
+          </w:p>
+        </w:tc>
+      </w:tr>
+      <w:tr>
+        <w:tc>
+          <w:tcPr/>
+          <w:p>
+            <w:pPr>
+              <w:pStyle w:val="Compact"/>
+              <w:jc w:val="left"/>
+            </w:pPr>
+            <w:r>
+              <w:t xml:space="preserve">Draft survey attempted</w:t>
+            </w:r>
+          </w:p>
+        </w:tc>
+        <w:tc>
+          <w:tcPr/>
+          <w:p>
+            <w:pPr>
+              <w:pStyle w:val="Compact"/>
+              <w:jc w:val="left"/>
+            </w:pPr>
+            <w:r>
+              <w:rPr>
+                <w:bCs/>
+                <w:b/>
+              </w:rPr>
+              <w:t xml:space="preserve">Blocked</w:t>
+            </w:r>
+            <w:r>
+              <w:t xml:space="preserve"> </w:t>
+            </w:r>
+            <w:r>
+              <w:t xml:space="preserve">—</w:t>
+            </w:r>
+            <w:r>
+              <w:t xml:space="preserve"> </w:t>
+            </w:r>
+            <w:r>
+              <w:t xml:space="preserve">“</w:t>
+            </w:r>
+            <w:r>
+              <w:t xml:space="preserve">Survey</w:t>
+            </w:r>
+            <w:r>
+              <w:t xml:space="preserve"> </w:t>
+            </w:r>
+            <w:r>
+              <w:t xml:space="preserve">‘</w:t>
+            </w:r>
+            <w:r>
+              <w:t xml:space="preserve">Complex Resolution Survey</w:t>
+            </w:r>
+            <w:r>
+              <w:t xml:space="preserve">’</w:t>
+            </w:r>
+            <w:r>
+              <w:t xml:space="preserve"> </w:t>
+            </w:r>
+            <w:r>
+              <w:t xml:space="preserve">is still in Draft. Publish it in Survey Designer before sending.</w:t>
+            </w:r>
+            <w:r>
+              <w:t xml:space="preserve">”</w:t>
+            </w:r>
+          </w:p>
+        </w:tc>
+      </w:tr>
+      <w:tr>
+        <w:tc>
+          <w:tcPr/>
+          <w:p>
+            <w:pPr>
+              <w:pStyle w:val="Compact"/>
+              <w:jc w:val="left"/>
+            </w:pPr>
+            <w:r>
+              <w:t xml:space="preserve">Published survey to a Primary User</w:t>
+            </w:r>
+          </w:p>
+        </w:tc>
+        <w:tc>
+          <w:tcPr/>
+          <w:p>
+            <w:pPr>
+              <w:pStyle w:val="Compact"/>
+              <w:jc w:val="left"/>
+            </w:pPr>
+            <w:r>
+              <w:t xml:space="preserve">Sent — instance created, invitation queued</w:t>
+            </w:r>
+          </w:p>
+        </w:tc>
+      </w:tr>
+      <w:tr>
+        <w:tc>
+          <w:tcPr/>
+          <w:p>
+            <w:pPr>
+              <w:pStyle w:val="Compact"/>
+              <w:jc w:val="left"/>
+            </w:pPr>
+            <w:r>
+              <w:t xml:space="preserve">Selecting 2 of 28 users</w:t>
+            </w:r>
+          </w:p>
+        </w:tc>
+        <w:tc>
+          <w:tcPr/>
+          <w:p>
+            <w:pPr>
+              <w:pStyle w:val="Compact"/>
+              <w:jc w:val="left"/>
+            </w:pPr>
+            <w:r>
+              <w:t xml:space="preserve">Exactly 2 recipients, confirmed in the audit table</w:t>
+            </w:r>
+          </w:p>
+        </w:tc>
+      </w:tr>
+      <w:tr>
+        <w:tc>
+          <w:tcPr/>
+          <w:p>
+            <w:pPr>
+              <w:pStyle w:val="Compact"/>
+              <w:jc w:val="left"/>
+            </w:pPr>
+            <w:r>
+              <w:t xml:space="preserve">Filtering the picker</w:t>
+            </w:r>
+          </w:p>
+        </w:tc>
+        <w:tc>
+          <w:tcPr/>
+          <w:p>
+            <w:pPr>
+              <w:pStyle w:val="Compact"/>
+              <w:jc w:val="left"/>
+            </w:pPr>
+            <w:r>
+              <w:t xml:space="preserve">28 narrowed to 1; only that person received it</w:t>
+            </w:r>
+          </w:p>
+        </w:tc>
+      </w:tr>
+    </w:tbl>
+    <w:bookmarkEnd w:id="28"/>
+    <w:bookmarkStart w:id="29" w:name="defects-found-and-resolved-during-build"/>
+    <w:p>
+      <w:pPr>
+        <w:pStyle w:val="Heading3"/>
+      </w:pPr>
+      <w:r>
+        <w:t xml:space="preserve">4.4 Defects found and resolved during build</w:t>
+      </w:r>
+    </w:p>
+    <w:tbl>
+      <w:tblPr>
+        <w:tblStyle w:val="Table"/>
+        <w:tblW w:type="pct" w:w="5000"/>
+        <w:tblLook w:firstRow="1" w:lastRow="0" w:firstColumn="0" w:lastColumn="0" w:noHBand="0" w:noVBand="0" w:val="0020"/>
+        <w:jc w:val="start"/>
+      </w:tblPr>
+      <w:tblGrid>
+        <w:gridCol w:w="2640"/>
+        <w:gridCol w:w="2640"/>
+        <w:gridCol w:w="2640"/>
+      </w:tblGrid>
+      <w:tr>
+        <w:trPr>
+          <w:tblHeader w:val="true"/>
+        </w:trPr>
+        <w:tc>
+          <w:tcPr/>
+          <w:p>
+            <w:pPr>
+              <w:pStyle w:val="Compact"/>
+              <w:jc w:val="left"/>
+            </w:pPr>
+            <w:r>
               <w:t xml:space="preserve">Issue</w:t>
             </w:r>
           </w:p>
@@ -3638,9 +4272,9 @@
         </w:pict>
       </w:r>
     </w:p>
-    <w:bookmarkEnd w:id="28"/>
     <w:bookmarkEnd w:id="29"/>
-    <w:bookmarkStart w:id="34" w:name="open-items-for-the-business"/>
+    <w:bookmarkEnd w:id="30"/>
+    <w:bookmarkStart w:id="35" w:name="open-items-for-the-business"/>
     <w:p>
       <w:pPr>
         <w:pStyle w:val="Heading2"/>
@@ -3649,7 +4283,7 @@
         <w:t xml:space="preserve">5. Open items for the business</w:t>
       </w:r>
     </w:p>
-    <w:bookmarkStart w:id="30" w:name="email-delivery-is-switched-off"/>
+    <w:bookmarkStart w:id="31" w:name="email-delivery-is-switched-off"/>
     <w:p>
       <w:pPr>
         <w:pStyle w:val="Heading3"/>
@@ -3746,8 +4380,8 @@
         <w:t xml:space="preserve">, but no email arrives.</w:t>
       </w:r>
     </w:p>
-    <w:bookmarkEnd w:id="30"/>
-    <w:bookmarkStart w:id="31" w:name="survey-content-is-not-ready"/>
+    <w:bookmarkEnd w:id="31"/>
+    <w:bookmarkStart w:id="32" w:name="survey-content-is-not-ready"/>
     <w:p>
       <w:pPr>
         <w:pStyle w:val="Heading3"/>
@@ -3978,8 +4612,8 @@
         <w:t xml:space="preserve">survey owner to complete and publish the two outstanding surveys.</w:t>
       </w:r>
     </w:p>
-    <w:bookmarkEnd w:id="31"/>
-    <w:bookmarkStart w:id="32" w:name="X39aa0619141a19cc8d93bd47586e0ff2b27a037"/>
+    <w:bookmarkEnd w:id="32"/>
+    <w:bookmarkStart w:id="33" w:name="X39aa0619141a19cc8d93bd47586e0ff2b27a037"/>
     <w:p>
       <w:pPr>
         <w:pStyle w:val="Heading3"/>
@@ -4062,8 +4696,8 @@
         <w:t xml:space="preserve">would remove that fragility.</w:t>
       </w:r>
     </w:p>
-    <w:bookmarkEnd w:id="32"/>
-    <w:bookmarkStart w:id="33" w:name="sending-is-synchronous"/>
+    <w:bookmarkEnd w:id="33"/>
+    <w:bookmarkStart w:id="34" w:name="sending-is-synchronous"/>
     <w:p>
       <w:pPr>
         <w:pStyle w:val="Heading3"/>
@@ -4099,9 +4733,9 @@
         </w:pict>
       </w:r>
     </w:p>
-    <w:bookmarkEnd w:id="33"/>
     <w:bookmarkEnd w:id="34"/>
-    <w:bookmarkStart w:id="35" w:name="migration"/>
+    <w:bookmarkEnd w:id="35"/>
+    <w:bookmarkStart w:id="36" w:name="migration"/>
     <w:p>
       <w:pPr>
         <w:pStyle w:val="Heading2"/>
@@ -4211,8 +4845,8 @@
         </w:pict>
       </w:r>
     </w:p>
-    <w:bookmarkEnd w:id="35"/>
-    <w:bookmarkStart w:id="36" w:name="recommendation"/>
+    <w:bookmarkEnd w:id="36"/>
+    <w:bookmarkStart w:id="37" w:name="recommendation"/>
     <w:p>
       <w:pPr>
         <w:pStyle w:val="Heading2"/>
@@ -4310,8 +4944,8 @@
         <w:t xml:space="preserve">can be validated with genuine recipients.</w:t>
       </w:r>
     </w:p>
-    <w:bookmarkEnd w:id="36"/>
     <w:bookmarkEnd w:id="37"/>
+    <w:bookmarkEnd w:id="38"/>
     <w:sectPr/>
   </w:body>
 </w:document>

</xml_diff>

<commit_message>
Document the rebrand, survey rename and landing page change
Co-authored-by: paladuguraj <paladuguraj@users.noreply.github.com>
</commit_message>
<xml_diff>
--- a/docs/CSAT Survey Portal - Functional Requirements and Test Report.docx
+++ b/docs/CSAT Survey Portal - Functional Requirements and Test Report.docx
@@ -28,7 +28,7 @@
         </w:p>
       </w:sdtContent>
     </w:sdt>
-    <w:bookmarkStart w:id="38" w:name="X5b5e0d4201f25ea5647317961a6b8e350744058"/>
+    <w:bookmarkStart w:id="39" w:name="X5b5e0d4201f25ea5647317961a6b8e350744058"/>
     <w:p>
       <w:pPr>
         <w:pStyle w:val="Heading1"/>
@@ -1284,6 +1284,174 @@
           </w:p>
         </w:tc>
       </w:tr>
+      <w:tr>
+        <w:tc>
+          <w:tcPr/>
+          <w:p>
+            <w:pPr>
+              <w:pStyle w:val="Compact"/>
+              <w:jc w:val="left"/>
+            </w:pPr>
+            <w:r>
+              <w:t xml:space="preserve">FR-24</w:t>
+            </w:r>
+          </w:p>
+        </w:tc>
+        <w:tc>
+          <w:tcPr/>
+          <w:p>
+            <w:pPr>
+              <w:pStyle w:val="Compact"/>
+              <w:jc w:val="left"/>
+            </w:pPr>
+            <w:r>
+              <w:t xml:space="preserve">The portal is branded</w:t>
+            </w:r>
+            <w:r>
+              <w:t xml:space="preserve"> </w:t>
+            </w:r>
+            <w:r>
+              <w:rPr>
+                <w:bCs/>
+                <w:b/>
+              </w:rPr>
+              <w:t xml:space="preserve">Network Operations CSAT Survey</w:t>
+            </w:r>
+            <w:r>
+              <w:t xml:space="preserve"> </w:t>
+            </w:r>
+            <w:r>
+              <w:t xml:space="preserve">with a</w:t>
+            </w:r>
+            <w:r>
+              <w:t xml:space="preserve"> </w:t>
+            </w:r>
+            <w:r>
+              <w:rPr>
+                <w:rStyle w:val="VerbatimChar"/>
+              </w:rPr>
+              <w:t xml:space="preserve">#011B58</w:t>
+            </w:r>
+            <w:r>
+              <w:t xml:space="preserve"> </w:t>
+            </w:r>
+            <w:r>
+              <w:t xml:space="preserve">header</w:t>
+            </w:r>
+          </w:p>
+        </w:tc>
+        <w:tc>
+          <w:tcPr/>
+          <w:p>
+            <w:pPr>
+              <w:pStyle w:val="Compact"/>
+              <w:jc w:val="left"/>
+            </w:pPr>
+            <w:r>
+              <w:t xml:space="preserve">Met</w:t>
+            </w:r>
+          </w:p>
+        </w:tc>
+      </w:tr>
+      <w:tr>
+        <w:tc>
+          <w:tcPr/>
+          <w:p>
+            <w:pPr>
+              <w:pStyle w:val="Compact"/>
+              <w:jc w:val="left"/>
+            </w:pPr>
+            <w:r>
+              <w:t xml:space="preserve">FR-25</w:t>
+            </w:r>
+          </w:p>
+        </w:tc>
+        <w:tc>
+          <w:tcPr/>
+          <w:p>
+            <w:pPr>
+              <w:pStyle w:val="Compact"/>
+              <w:jc w:val="left"/>
+            </w:pPr>
+            <w:r>
+              <w:t xml:space="preserve">Recipients land</w:t>
+            </w:r>
+            <w:r>
+              <w:t xml:space="preserve"> </w:t>
+            </w:r>
+            <w:r>
+              <w:rPr>
+                <w:bCs/>
+                <w:b/>
+              </w:rPr>
+              <w:t xml:space="preserve">directly on the first question</w:t>
+            </w:r>
+            <w:r>
+              <w:t xml:space="preserve">, with no Get Started page</w:t>
+            </w:r>
+          </w:p>
+        </w:tc>
+        <w:tc>
+          <w:tcPr/>
+          <w:p>
+            <w:pPr>
+              <w:pStyle w:val="Compact"/>
+              <w:jc w:val="left"/>
+            </w:pPr>
+            <w:r>
+              <w:t xml:space="preserve">Met</w:t>
+            </w:r>
+          </w:p>
+        </w:tc>
+      </w:tr>
+      <w:tr>
+        <w:tc>
+          <w:tcPr/>
+          <w:p>
+            <w:pPr>
+              <w:pStyle w:val="Compact"/>
+              <w:jc w:val="left"/>
+            </w:pPr>
+            <w:r>
+              <w:t xml:space="preserve">FR-26</w:t>
+            </w:r>
+          </w:p>
+        </w:tc>
+        <w:tc>
+          <w:tcPr/>
+          <w:p>
+            <w:pPr>
+              <w:pStyle w:val="Compact"/>
+              <w:jc w:val="left"/>
+            </w:pPr>
+            <w:r>
+              <w:t xml:space="preserve">Branding and landing-page changes affect</w:t>
+            </w:r>
+            <w:r>
+              <w:t xml:space="preserve"> </w:t>
+            </w:r>
+            <w:r>
+              <w:rPr>
+                <w:bCs/>
+                <w:b/>
+              </w:rPr>
+              <w:t xml:space="preserve">only this portal and these surveys</w:t>
+            </w:r>
+          </w:p>
+        </w:tc>
+        <w:tc>
+          <w:tcPr/>
+          <w:p>
+            <w:pPr>
+              <w:pStyle w:val="Compact"/>
+              <w:jc w:val="left"/>
+            </w:pPr>
+            <w:r>
+              <w:t xml:space="preserve">Met</w:t>
+            </w:r>
+          </w:p>
+        </w:tc>
+      </w:tr>
     </w:tbl>
     <w:bookmarkStart w:id="21" w:name="business-rules-in-plain-terms"/>
     <w:p>
@@ -1627,7 +1795,7 @@
       </w:r>
     </w:p>
     <w:bookmarkEnd w:id="23"/>
-    <w:bookmarkStart w:id="30" w:name="test-report"/>
+    <w:bookmarkStart w:id="31" w:name="test-report"/>
     <w:p>
       <w:pPr>
         <w:pStyle w:val="Heading2"/>
@@ -1981,7 +2149,7 @@
               <w:jc w:val="left"/>
             </w:pPr>
             <w:r>
-              <w:t xml:space="preserve">Generic Quarterly Survey allows scheduling</w:t>
+              <w:t xml:space="preserve">Generic Schedule Survey allows scheduling</w:t>
             </w:r>
           </w:p>
         </w:tc>
@@ -2844,7 +3012,7 @@
               <w:jc w:val="left"/>
             </w:pPr>
             <w:r>
-              <w:t xml:space="preserve">Complex Resolution Survey, Generic Quarterly Survey</w:t>
+              <w:t xml:space="preserve">Complex Resolution Survey, Generic Schedule Survey</w:t>
             </w:r>
           </w:p>
         </w:tc>
@@ -3655,282 +3823,13 @@
       </w:r>
     </w:p>
     <w:bookmarkEnd w:id="27"/>
-    <w:bookmarkStart w:id="28" w:name="rules-proven-with-live-data"/>
+    <w:bookmarkStart w:id="28" w:name="X59420ba93163d28a5b47b208c96083fb5d19cf8"/>
     <w:p>
       <w:pPr>
         <w:pStyle w:val="Heading3"/>
       </w:pPr>
       <w:r>
-        <w:t xml:space="preserve">4.3 Rules proven with live data</w:t>
-      </w:r>
-    </w:p>
-    <w:tbl>
-      <w:tblPr>
-        <w:tblStyle w:val="Table"/>
-        <w:tblW w:type="pct" w:w="5000"/>
-        <w:tblLook w:firstRow="1" w:lastRow="0" w:firstColumn="0" w:lastColumn="0" w:noHBand="0" w:noVBand="0" w:val="0020"/>
-        <w:jc w:val="start"/>
-      </w:tblPr>
-      <w:tblGrid>
-        <w:gridCol w:w="3960"/>
-        <w:gridCol w:w="3960"/>
-      </w:tblGrid>
-      <w:tr>
-        <w:trPr>
-          <w:tblHeader w:val="true"/>
-        </w:trPr>
-        <w:tc>
-          <w:tcPr/>
-          <w:p>
-            <w:pPr>
-              <w:pStyle w:val="Compact"/>
-              <w:jc w:val="left"/>
-            </w:pPr>
-            <w:r>
-              <w:t xml:space="preserve">Scenario</w:t>
-            </w:r>
-          </w:p>
-        </w:tc>
-        <w:tc>
-          <w:tcPr/>
-          <w:p>
-            <w:pPr>
-              <w:pStyle w:val="Compact"/>
-              <w:jc w:val="left"/>
-            </w:pPr>
-            <w:r>
-              <w:t xml:space="preserve">Result</w:t>
-            </w:r>
-          </w:p>
-        </w:tc>
-      </w:tr>
-      <w:tr>
-        <w:tc>
-          <w:tcPr/>
-          <w:p>
-            <w:pPr>
-              <w:pStyle w:val="Compact"/>
-              <w:jc w:val="left"/>
-            </w:pPr>
-            <w:r>
-              <w:t xml:space="preserve">First survey to a new recipient</w:t>
-            </w:r>
-          </w:p>
-        </w:tc>
-        <w:tc>
-          <w:tcPr/>
-          <w:p>
-            <w:pPr>
-              <w:pStyle w:val="Compact"/>
-              <w:jc w:val="left"/>
-            </w:pPr>
-            <w:r>
-              <w:t xml:space="preserve">Sent, assessment instance created, invitation queued</w:t>
-            </w:r>
-          </w:p>
-        </w:tc>
-      </w:tr>
-      <w:tr>
-        <w:tc>
-          <w:tcPr/>
-          <w:p>
-            <w:pPr>
-              <w:pStyle w:val="Compact"/>
-              <w:jc w:val="left"/>
-            </w:pPr>
-            <w:r>
-              <w:t xml:space="preserve">Same recipient again immediately</w:t>
-            </w:r>
-          </w:p>
-        </w:tc>
-        <w:tc>
-          <w:tcPr/>
-          <w:p>
-            <w:pPr>
-              <w:pStyle w:val="Compact"/>
-              <w:jc w:val="left"/>
-            </w:pPr>
-            <w:r>
-              <w:rPr>
-                <w:bCs/>
-                <w:b/>
-              </w:rPr>
-              <w:t xml:space="preserve">Blocked</w:t>
-            </w:r>
-            <w:r>
-              <w:t xml:space="preserve"> </w:t>
-            </w:r>
-            <w:r>
-              <w:t xml:space="preserve">—</w:t>
-            </w:r>
-            <w:r>
-              <w:t xml:space="preserve"> </w:t>
-            </w:r>
-            <w:r>
-              <w:t xml:space="preserve">“</w:t>
-            </w:r>
-            <w:r>
-              <w:t xml:space="preserve">Surveyed on 2026-08-01 09:13:50. Eligible again in 90 day(s).</w:t>
-            </w:r>
-            <w:r>
-              <w:t xml:space="preserve">”</w:t>
-            </w:r>
-          </w:p>
-        </w:tc>
-      </w:tr>
-      <w:tr>
-        <w:tc>
-          <w:tcPr/>
-          <w:p>
-            <w:pPr>
-              <w:pStyle w:val="Compact"/>
-              <w:jc w:val="left"/>
-            </w:pPr>
-            <w:r>
-              <w:t xml:space="preserve">Draft survey attempted</w:t>
-            </w:r>
-          </w:p>
-        </w:tc>
-        <w:tc>
-          <w:tcPr/>
-          <w:p>
-            <w:pPr>
-              <w:pStyle w:val="Compact"/>
-              <w:jc w:val="left"/>
-            </w:pPr>
-            <w:r>
-              <w:rPr>
-                <w:bCs/>
-                <w:b/>
-              </w:rPr>
-              <w:t xml:space="preserve">Blocked</w:t>
-            </w:r>
-            <w:r>
-              <w:t xml:space="preserve"> </w:t>
-            </w:r>
-            <w:r>
-              <w:t xml:space="preserve">—</w:t>
-            </w:r>
-            <w:r>
-              <w:t xml:space="preserve"> </w:t>
-            </w:r>
-            <w:r>
-              <w:t xml:space="preserve">“</w:t>
-            </w:r>
-            <w:r>
-              <w:t xml:space="preserve">Survey</w:t>
-            </w:r>
-            <w:r>
-              <w:t xml:space="preserve"> </w:t>
-            </w:r>
-            <w:r>
-              <w:t xml:space="preserve">‘</w:t>
-            </w:r>
-            <w:r>
-              <w:t xml:space="preserve">Complex Resolution Survey</w:t>
-            </w:r>
-            <w:r>
-              <w:t xml:space="preserve">’</w:t>
-            </w:r>
-            <w:r>
-              <w:t xml:space="preserve"> </w:t>
-            </w:r>
-            <w:r>
-              <w:t xml:space="preserve">is still in Draft. Publish it in Survey Designer before sending.</w:t>
-            </w:r>
-            <w:r>
-              <w:t xml:space="preserve">”</w:t>
-            </w:r>
-          </w:p>
-        </w:tc>
-      </w:tr>
-      <w:tr>
-        <w:tc>
-          <w:tcPr/>
-          <w:p>
-            <w:pPr>
-              <w:pStyle w:val="Compact"/>
-              <w:jc w:val="left"/>
-            </w:pPr>
-            <w:r>
-              <w:t xml:space="preserve">Published survey to a Primary User</w:t>
-            </w:r>
-          </w:p>
-        </w:tc>
-        <w:tc>
-          <w:tcPr/>
-          <w:p>
-            <w:pPr>
-              <w:pStyle w:val="Compact"/>
-              <w:jc w:val="left"/>
-            </w:pPr>
-            <w:r>
-              <w:t xml:space="preserve">Sent — instance created, invitation queued</w:t>
-            </w:r>
-          </w:p>
-        </w:tc>
-      </w:tr>
-      <w:tr>
-        <w:tc>
-          <w:tcPr/>
-          <w:p>
-            <w:pPr>
-              <w:pStyle w:val="Compact"/>
-              <w:jc w:val="left"/>
-            </w:pPr>
-            <w:r>
-              <w:t xml:space="preserve">Selecting 2 of 28 users</w:t>
-            </w:r>
-          </w:p>
-        </w:tc>
-        <w:tc>
-          <w:tcPr/>
-          <w:p>
-            <w:pPr>
-              <w:pStyle w:val="Compact"/>
-              <w:jc w:val="left"/>
-            </w:pPr>
-            <w:r>
-              <w:t xml:space="preserve">Exactly 2 recipients, confirmed in the audit table</w:t>
-            </w:r>
-          </w:p>
-        </w:tc>
-      </w:tr>
-      <w:tr>
-        <w:tc>
-          <w:tcPr/>
-          <w:p>
-            <w:pPr>
-              <w:pStyle w:val="Compact"/>
-              <w:jc w:val="left"/>
-            </w:pPr>
-            <w:r>
-              <w:t xml:space="preserve">Filtering the picker</w:t>
-            </w:r>
-          </w:p>
-        </w:tc>
-        <w:tc>
-          <w:tcPr/>
-          <w:p>
-            <w:pPr>
-              <w:pStyle w:val="Compact"/>
-              <w:jc w:val="left"/>
-            </w:pPr>
-            <w:r>
-              <w:t xml:space="preserve">28 narrowed to 1; only that person received it</w:t>
-            </w:r>
-          </w:p>
-        </w:tc>
-      </w:tr>
-    </w:tbl>
-    <w:bookmarkEnd w:id="28"/>
-    <w:bookmarkStart w:id="29" w:name="defects-found-and-resolved-during-build"/>
-    <w:p>
-      <w:pPr>
-        <w:pStyle w:val="Heading3"/>
-      </w:pPr>
-      <w:r>
-        <w:t xml:space="preserve">4.4 Defects found and resolved during build</w:t>
+        <w:t xml:space="preserve">4.2c Branding and survey landing page — passed</w:t>
       </w:r>
     </w:p>
     <w:tbl>
@@ -3957,6 +3856,680 @@
               <w:jc w:val="left"/>
             </w:pPr>
             <w:r>
+              <w:t xml:space="preserve">Check</w:t>
+            </w:r>
+          </w:p>
+        </w:tc>
+        <w:tc>
+          <w:tcPr/>
+          <w:p>
+            <w:pPr>
+              <w:pStyle w:val="Compact"/>
+              <w:jc w:val="left"/>
+            </w:pPr>
+            <w:r>
+              <w:t xml:space="preserve">Covers</w:t>
+            </w:r>
+          </w:p>
+        </w:tc>
+        <w:tc>
+          <w:tcPr/>
+          <w:p>
+            <w:pPr>
+              <w:pStyle w:val="Compact"/>
+              <w:jc w:val="left"/>
+            </w:pPr>
+            <w:r>
+              <w:t xml:space="preserve">Observed</w:t>
+            </w:r>
+          </w:p>
+        </w:tc>
+      </w:tr>
+      <w:tr>
+        <w:tc>
+          <w:tcPr/>
+          <w:p>
+            <w:pPr>
+              <w:pStyle w:val="Compact"/>
+              <w:jc w:val="left"/>
+            </w:pPr>
+            <w:r>
+              <w:t xml:space="preserve">Portal title</w:t>
+            </w:r>
+          </w:p>
+        </w:tc>
+        <w:tc>
+          <w:tcPr/>
+          <w:p>
+            <w:pPr>
+              <w:pStyle w:val="Compact"/>
+              <w:jc w:val="left"/>
+            </w:pPr>
+            <w:r>
+              <w:t xml:space="preserve">FR-24</w:t>
+            </w:r>
+          </w:p>
+        </w:tc>
+        <w:tc>
+          <w:tcPr/>
+          <w:p>
+            <w:pPr>
+              <w:pStyle w:val="Compact"/>
+              <w:jc w:val="left"/>
+            </w:pPr>
+            <w:r>
+              <w:t xml:space="preserve">Page title reads</w:t>
+            </w:r>
+            <w:r>
+              <w:t xml:space="preserve"> </w:t>
+            </w:r>
+            <w:r>
+              <w:rPr>
+                <w:iCs/>
+                <w:i/>
+              </w:rPr>
+              <w:t xml:space="preserve">Service Portal - Network Operations CSAT Survey</w:t>
+            </w:r>
+          </w:p>
+        </w:tc>
+      </w:tr>
+      <w:tr>
+        <w:tc>
+          <w:tcPr/>
+          <w:p>
+            <w:pPr>
+              <w:pStyle w:val="Compact"/>
+              <w:jc w:val="left"/>
+            </w:pPr>
+            <w:r>
+              <w:t xml:space="preserve">Header colour</w:t>
+            </w:r>
+          </w:p>
+        </w:tc>
+        <w:tc>
+          <w:tcPr/>
+          <w:p>
+            <w:pPr>
+              <w:pStyle w:val="Compact"/>
+              <w:jc w:val="left"/>
+            </w:pPr>
+            <w:r>
+              <w:t xml:space="preserve">FR-24</w:t>
+            </w:r>
+          </w:p>
+        </w:tc>
+        <w:tc>
+          <w:tcPr/>
+          <w:p>
+            <w:pPr>
+              <w:pStyle w:val="Compact"/>
+              <w:jc w:val="left"/>
+            </w:pPr>
+            <w:r>
+              <w:t xml:space="preserve">Compiled CSS gives</w:t>
+            </w:r>
+            <w:r>
+              <w:t xml:space="preserve"> </w:t>
+            </w:r>
+            <w:r>
+              <w:rPr>
+                <w:rStyle w:val="VerbatimChar"/>
+              </w:rPr>
+              <w:t xml:space="preserve">.navbar-inverse { background-color: #011B58 }</w:t>
+            </w:r>
+          </w:p>
+        </w:tc>
+      </w:tr>
+      <w:tr>
+        <w:tc>
+          <w:tcPr/>
+          <w:p>
+            <w:pPr>
+              <w:pStyle w:val="Compact"/>
+              <w:jc w:val="left"/>
+            </w:pPr>
+            <w:r>
+              <w:t xml:space="preserve">Other portals unaffected</w:t>
+            </w:r>
+          </w:p>
+        </w:tc>
+        <w:tc>
+          <w:tcPr/>
+          <w:p>
+            <w:pPr>
+              <w:pStyle w:val="Compact"/>
+              <w:jc w:val="left"/>
+            </w:pPr>
+            <w:r>
+              <w:t xml:space="preserve">FR-26</w:t>
+            </w:r>
+          </w:p>
+        </w:tc>
+        <w:tc>
+          <w:tcPr/>
+          <w:p>
+            <w:pPr>
+              <w:pStyle w:val="Compact"/>
+              <w:jc w:val="left"/>
+            </w:pPr>
+            <w:r>
+              <w:rPr>
+                <w:rStyle w:val="VerbatimChar"/>
+              </w:rPr>
+              <w:t xml:space="preserve">/sp</w:t>
+            </w:r>
+            <w:r>
+              <w:t xml:space="preserve">,</w:t>
+            </w:r>
+            <w:r>
+              <w:t xml:space="preserve"> </w:t>
+            </w:r>
+            <w:r>
+              <w:rPr>
+                <w:rStyle w:val="VerbatimChar"/>
+              </w:rPr>
+              <w:t xml:space="preserve">/kb</w:t>
+            </w:r>
+            <w:r>
+              <w:t xml:space="preserve">,</w:t>
+            </w:r>
+            <w:r>
+              <w:t xml:space="preserve"> </w:t>
+            </w:r>
+            <w:r>
+              <w:rPr>
+                <w:rStyle w:val="VerbatimChar"/>
+              </w:rPr>
+              <w:t xml:space="preserve">/tao</w:t>
+            </w:r>
+            <w:r>
+              <w:t xml:space="preserve">,</w:t>
+            </w:r>
+            <w:r>
+              <w:t xml:space="preserve"> </w:t>
+            </w:r>
+            <w:r>
+              <w:rPr>
+                <w:rStyle w:val="VerbatimChar"/>
+              </w:rPr>
+              <w:t xml:space="preserve">/sp_config</w:t>
+            </w:r>
+            <w:r>
+              <w:t xml:space="preserve"> </w:t>
+            </w:r>
+            <w:r>
+              <w:t xml:space="preserve">still on the Stock theme, none resolving to</w:t>
+            </w:r>
+            <w:r>
+              <w:t xml:space="preserve"> </w:t>
+            </w:r>
+            <w:r>
+              <w:rPr>
+                <w:rStyle w:val="VerbatimChar"/>
+              </w:rPr>
+              <w:t xml:space="preserve">#011B58</w:t>
+            </w:r>
+          </w:p>
+        </w:tc>
+      </w:tr>
+      <w:tr>
+        <w:tc>
+          <w:tcPr/>
+          <w:p>
+            <w:pPr>
+              <w:pStyle w:val="Compact"/>
+              <w:jc w:val="left"/>
+            </w:pPr>
+            <w:r>
+              <w:t xml:space="preserve">No Get Started page</w:t>
+            </w:r>
+          </w:p>
+        </w:tc>
+        <w:tc>
+          <w:tcPr/>
+          <w:p>
+            <w:pPr>
+              <w:pStyle w:val="Compact"/>
+              <w:jc w:val="left"/>
+            </w:pPr>
+            <w:r>
+              <w:t xml:space="preserve">FR-25</w:t>
+            </w:r>
+          </w:p>
+        </w:tc>
+        <w:tc>
+          <w:tcPr/>
+          <w:p>
+            <w:pPr>
+              <w:pStyle w:val="Compact"/>
+              <w:jc w:val="left"/>
+            </w:pPr>
+            <w:r>
+              <w:t xml:space="preserve">Loading a real survey as its recipient returns</w:t>
+            </w:r>
+            <w:r>
+              <w:t xml:space="preserve"> </w:t>
+            </w:r>
+            <w:r>
+              <w:rPr>
+                <w:rStyle w:val="VerbatimChar"/>
+              </w:rPr>
+              <w:t xml:space="preserve">not_show_intro_note = true</w:t>
+            </w:r>
+            <w:r>
+              <w:t xml:space="preserve">, so the widget opens on the first question</w:t>
+            </w:r>
+          </w:p>
+        </w:tc>
+      </w:tr>
+      <w:tr>
+        <w:tc>
+          <w:tcPr/>
+          <w:p>
+            <w:pPr>
+              <w:pStyle w:val="Compact"/>
+              <w:jc w:val="left"/>
+            </w:pPr>
+            <w:r>
+              <w:t xml:space="preserve">Other surveys unaffected</w:t>
+            </w:r>
+          </w:p>
+        </w:tc>
+        <w:tc>
+          <w:tcPr/>
+          <w:p>
+            <w:pPr>
+              <w:pStyle w:val="Compact"/>
+              <w:jc w:val="left"/>
+            </w:pPr>
+            <w:r>
+              <w:t xml:space="preserve">FR-26</w:t>
+            </w:r>
+          </w:p>
+        </w:tc>
+        <w:tc>
+          <w:tcPr/>
+          <w:p>
+            <w:pPr>
+              <w:pStyle w:val="Compact"/>
+              <w:jc w:val="left"/>
+            </w:pPr>
+            <w:r>
+              <w:t xml:space="preserve">Closed Case Survey still shows its landing page</w:t>
+            </w:r>
+          </w:p>
+        </w:tc>
+      </w:tr>
+      <w:tr>
+        <w:tc>
+          <w:tcPr/>
+          <w:p>
+            <w:pPr>
+              <w:pStyle w:val="Compact"/>
+              <w:jc w:val="left"/>
+            </w:pPr>
+            <w:r>
+              <w:t xml:space="preserve">Survey rename applied everywhere</w:t>
+            </w:r>
+          </w:p>
+        </w:tc>
+        <w:tc>
+          <w:tcPr/>
+          <w:p>
+            <w:pPr>
+              <w:pStyle w:val="Compact"/>
+              <w:jc w:val="left"/>
+            </w:pPr>
+            <w:r>
+              <w:t xml:space="preserve">—</w:t>
+            </w:r>
+          </w:p>
+        </w:tc>
+        <w:tc>
+          <w:tcPr/>
+          <w:p>
+            <w:pPr>
+              <w:pStyle w:val="Compact"/>
+              <w:jc w:val="left"/>
+            </w:pPr>
+            <w:r>
+              <w:t xml:space="preserve">Definition, description, category and the</w:t>
+            </w:r>
+            <w:r>
+              <w:t xml:space="preserve"> </w:t>
+            </w:r>
+            <w:r>
+              <w:rPr>
+                <w:rStyle w:val="VerbatimChar"/>
+              </w:rPr>
+              <w:t xml:space="preserve">csat.portal.survey_names</w:t>
+            </w:r>
+            <w:r>
+              <w:t xml:space="preserve"> </w:t>
+            </w:r>
+            <w:r>
+              <w:t xml:space="preserve">allow-list all read</w:t>
+            </w:r>
+            <w:r>
+              <w:t xml:space="preserve"> </w:t>
+            </w:r>
+            <w:r>
+              <w:rPr>
+                <w:iCs/>
+                <w:i/>
+              </w:rPr>
+              <w:t xml:space="preserve">Generic Schedule Survey</w:t>
+            </w:r>
+            <w:r>
+              <w:t xml:space="preserve">; the request form and report filter both offer it</w:t>
+            </w:r>
+          </w:p>
+        </w:tc>
+      </w:tr>
+    </w:tbl>
+    <w:bookmarkEnd w:id="28"/>
+    <w:bookmarkStart w:id="29" w:name="rules-proven-with-live-data"/>
+    <w:p>
+      <w:pPr>
+        <w:pStyle w:val="Heading3"/>
+      </w:pPr>
+      <w:r>
+        <w:t xml:space="preserve">4.3 Rules proven with live data</w:t>
+      </w:r>
+    </w:p>
+    <w:tbl>
+      <w:tblPr>
+        <w:tblStyle w:val="Table"/>
+        <w:tblW w:type="pct" w:w="5000"/>
+        <w:tblLook w:firstRow="1" w:lastRow="0" w:firstColumn="0" w:lastColumn="0" w:noHBand="0" w:noVBand="0" w:val="0020"/>
+        <w:jc w:val="start"/>
+      </w:tblPr>
+      <w:tblGrid>
+        <w:gridCol w:w="3960"/>
+        <w:gridCol w:w="3960"/>
+      </w:tblGrid>
+      <w:tr>
+        <w:trPr>
+          <w:tblHeader w:val="true"/>
+        </w:trPr>
+        <w:tc>
+          <w:tcPr/>
+          <w:p>
+            <w:pPr>
+              <w:pStyle w:val="Compact"/>
+              <w:jc w:val="left"/>
+            </w:pPr>
+            <w:r>
+              <w:t xml:space="preserve">Scenario</w:t>
+            </w:r>
+          </w:p>
+        </w:tc>
+        <w:tc>
+          <w:tcPr/>
+          <w:p>
+            <w:pPr>
+              <w:pStyle w:val="Compact"/>
+              <w:jc w:val="left"/>
+            </w:pPr>
+            <w:r>
+              <w:t xml:space="preserve">Result</w:t>
+            </w:r>
+          </w:p>
+        </w:tc>
+      </w:tr>
+      <w:tr>
+        <w:tc>
+          <w:tcPr/>
+          <w:p>
+            <w:pPr>
+              <w:pStyle w:val="Compact"/>
+              <w:jc w:val="left"/>
+            </w:pPr>
+            <w:r>
+              <w:t xml:space="preserve">First survey to a new recipient</w:t>
+            </w:r>
+          </w:p>
+        </w:tc>
+        <w:tc>
+          <w:tcPr/>
+          <w:p>
+            <w:pPr>
+              <w:pStyle w:val="Compact"/>
+              <w:jc w:val="left"/>
+            </w:pPr>
+            <w:r>
+              <w:t xml:space="preserve">Sent, assessment instance created, invitation queued</w:t>
+            </w:r>
+          </w:p>
+        </w:tc>
+      </w:tr>
+      <w:tr>
+        <w:tc>
+          <w:tcPr/>
+          <w:p>
+            <w:pPr>
+              <w:pStyle w:val="Compact"/>
+              <w:jc w:val="left"/>
+            </w:pPr>
+            <w:r>
+              <w:t xml:space="preserve">Same recipient again immediately</w:t>
+            </w:r>
+          </w:p>
+        </w:tc>
+        <w:tc>
+          <w:tcPr/>
+          <w:p>
+            <w:pPr>
+              <w:pStyle w:val="Compact"/>
+              <w:jc w:val="left"/>
+            </w:pPr>
+            <w:r>
+              <w:rPr>
+                <w:bCs/>
+                <w:b/>
+              </w:rPr>
+              <w:t xml:space="preserve">Blocked</w:t>
+            </w:r>
+            <w:r>
+              <w:t xml:space="preserve"> </w:t>
+            </w:r>
+            <w:r>
+              <w:t xml:space="preserve">—</w:t>
+            </w:r>
+            <w:r>
+              <w:t xml:space="preserve"> </w:t>
+            </w:r>
+            <w:r>
+              <w:t xml:space="preserve">“</w:t>
+            </w:r>
+            <w:r>
+              <w:t xml:space="preserve">Surveyed on 2026-08-01 09:13:50. Eligible again in 90 day(s).</w:t>
+            </w:r>
+            <w:r>
+              <w:t xml:space="preserve">”</w:t>
+            </w:r>
+          </w:p>
+        </w:tc>
+      </w:tr>
+      <w:tr>
+        <w:tc>
+          <w:tcPr/>
+          <w:p>
+            <w:pPr>
+              <w:pStyle w:val="Compact"/>
+              <w:jc w:val="left"/>
+            </w:pPr>
+            <w:r>
+              <w:t xml:space="preserve">Draft survey attempted</w:t>
+            </w:r>
+          </w:p>
+        </w:tc>
+        <w:tc>
+          <w:tcPr/>
+          <w:p>
+            <w:pPr>
+              <w:pStyle w:val="Compact"/>
+              <w:jc w:val="left"/>
+            </w:pPr>
+            <w:r>
+              <w:rPr>
+                <w:bCs/>
+                <w:b/>
+              </w:rPr>
+              <w:t xml:space="preserve">Blocked</w:t>
+            </w:r>
+            <w:r>
+              <w:t xml:space="preserve"> </w:t>
+            </w:r>
+            <w:r>
+              <w:t xml:space="preserve">—</w:t>
+            </w:r>
+            <w:r>
+              <w:t xml:space="preserve"> </w:t>
+            </w:r>
+            <w:r>
+              <w:t xml:space="preserve">“</w:t>
+            </w:r>
+            <w:r>
+              <w:t xml:space="preserve">Survey</w:t>
+            </w:r>
+            <w:r>
+              <w:t xml:space="preserve"> </w:t>
+            </w:r>
+            <w:r>
+              <w:t xml:space="preserve">‘</w:t>
+            </w:r>
+            <w:r>
+              <w:t xml:space="preserve">Complex Resolution Survey</w:t>
+            </w:r>
+            <w:r>
+              <w:t xml:space="preserve">’</w:t>
+            </w:r>
+            <w:r>
+              <w:t xml:space="preserve"> </w:t>
+            </w:r>
+            <w:r>
+              <w:t xml:space="preserve">is still in Draft. Publish it in Survey Designer before sending.</w:t>
+            </w:r>
+            <w:r>
+              <w:t xml:space="preserve">”</w:t>
+            </w:r>
+          </w:p>
+        </w:tc>
+      </w:tr>
+      <w:tr>
+        <w:tc>
+          <w:tcPr/>
+          <w:p>
+            <w:pPr>
+              <w:pStyle w:val="Compact"/>
+              <w:jc w:val="left"/>
+            </w:pPr>
+            <w:r>
+              <w:t xml:space="preserve">Published survey to a Primary User</w:t>
+            </w:r>
+          </w:p>
+        </w:tc>
+        <w:tc>
+          <w:tcPr/>
+          <w:p>
+            <w:pPr>
+              <w:pStyle w:val="Compact"/>
+              <w:jc w:val="left"/>
+            </w:pPr>
+            <w:r>
+              <w:t xml:space="preserve">Sent — instance created, invitation queued</w:t>
+            </w:r>
+          </w:p>
+        </w:tc>
+      </w:tr>
+      <w:tr>
+        <w:tc>
+          <w:tcPr/>
+          <w:p>
+            <w:pPr>
+              <w:pStyle w:val="Compact"/>
+              <w:jc w:val="left"/>
+            </w:pPr>
+            <w:r>
+              <w:t xml:space="preserve">Selecting 2 of 28 users</w:t>
+            </w:r>
+          </w:p>
+        </w:tc>
+        <w:tc>
+          <w:tcPr/>
+          <w:p>
+            <w:pPr>
+              <w:pStyle w:val="Compact"/>
+              <w:jc w:val="left"/>
+            </w:pPr>
+            <w:r>
+              <w:t xml:space="preserve">Exactly 2 recipients, confirmed in the audit table</w:t>
+            </w:r>
+          </w:p>
+        </w:tc>
+      </w:tr>
+      <w:tr>
+        <w:tc>
+          <w:tcPr/>
+          <w:p>
+            <w:pPr>
+              <w:pStyle w:val="Compact"/>
+              <w:jc w:val="left"/>
+            </w:pPr>
+            <w:r>
+              <w:t xml:space="preserve">Filtering the picker</w:t>
+            </w:r>
+          </w:p>
+        </w:tc>
+        <w:tc>
+          <w:tcPr/>
+          <w:p>
+            <w:pPr>
+              <w:pStyle w:val="Compact"/>
+              <w:jc w:val="left"/>
+            </w:pPr>
+            <w:r>
+              <w:t xml:space="preserve">28 narrowed to 1; only that person received it</w:t>
+            </w:r>
+          </w:p>
+        </w:tc>
+      </w:tr>
+    </w:tbl>
+    <w:bookmarkEnd w:id="29"/>
+    <w:bookmarkStart w:id="30" w:name="defects-found-and-resolved-during-build"/>
+    <w:p>
+      <w:pPr>
+        <w:pStyle w:val="Heading3"/>
+      </w:pPr>
+      <w:r>
+        <w:t xml:space="preserve">4.4 Defects found and resolved during build</w:t>
+      </w:r>
+    </w:p>
+    <w:tbl>
+      <w:tblPr>
+        <w:tblStyle w:val="Table"/>
+        <w:tblW w:type="pct" w:w="5000"/>
+        <w:tblLook w:firstRow="1" w:lastRow="0" w:firstColumn="0" w:lastColumn="0" w:noHBand="0" w:noVBand="0" w:val="0020"/>
+        <w:jc w:val="start"/>
+      </w:tblPr>
+      <w:tblGrid>
+        <w:gridCol w:w="2640"/>
+        <w:gridCol w:w="2640"/>
+        <w:gridCol w:w="2640"/>
+      </w:tblGrid>
+      <w:tr>
+        <w:trPr>
+          <w:tblHeader w:val="true"/>
+        </w:trPr>
+        <w:tc>
+          <w:tcPr/>
+          <w:p>
+            <w:pPr>
+              <w:pStyle w:val="Compact"/>
+              <w:jc w:val="left"/>
+            </w:pPr>
+            <w:r>
               <w:t xml:space="preserve">Issue</w:t>
             </w:r>
           </w:p>
@@ -4272,9 +4845,9 @@
         </w:pict>
       </w:r>
     </w:p>
-    <w:bookmarkEnd w:id="29"/>
     <w:bookmarkEnd w:id="30"/>
-    <w:bookmarkStart w:id="35" w:name="open-items-for-the-business"/>
+    <w:bookmarkEnd w:id="31"/>
+    <w:bookmarkStart w:id="36" w:name="open-items-for-the-business"/>
     <w:p>
       <w:pPr>
         <w:pStyle w:val="Heading2"/>
@@ -4283,7 +4856,7 @@
         <w:t xml:space="preserve">5. Open items for the business</w:t>
       </w:r>
     </w:p>
-    <w:bookmarkStart w:id="31" w:name="email-delivery-is-switched-off"/>
+    <w:bookmarkStart w:id="32" w:name="email-delivery-is-switched-off"/>
     <w:p>
       <w:pPr>
         <w:pStyle w:val="Heading3"/>
@@ -4380,8 +4953,8 @@
         <w:t xml:space="preserve">, but no email arrives.</w:t>
       </w:r>
     </w:p>
-    <w:bookmarkEnd w:id="31"/>
-    <w:bookmarkStart w:id="32" w:name="survey-content-is-not-ready"/>
+    <w:bookmarkEnd w:id="32"/>
+    <w:bookmarkStart w:id="33" w:name="survey-content-is-not-ready"/>
     <w:p>
       <w:pPr>
         <w:pStyle w:val="Heading3"/>
@@ -4536,7 +5109,7 @@
               <w:jc w:val="left"/>
             </w:pPr>
             <w:r>
-              <w:t xml:space="preserve">Generic Quarterly Survey</w:t>
+              <w:t xml:space="preserve">Generic Schedule Survey</w:t>
             </w:r>
           </w:p>
         </w:tc>
@@ -4612,8 +5185,8 @@
         <w:t xml:space="preserve">survey owner to complete and publish the two outstanding surveys.</w:t>
       </w:r>
     </w:p>
-    <w:bookmarkEnd w:id="32"/>
-    <w:bookmarkStart w:id="33" w:name="X39aa0619141a19cc8d93bd47586e0ff2b27a037"/>
+    <w:bookmarkEnd w:id="33"/>
+    <w:bookmarkStart w:id="34" w:name="X39aa0619141a19cc8d93bd47586e0ff2b27a037"/>
     <w:p>
       <w:pPr>
         <w:pStyle w:val="Heading3"/>
@@ -4696,8 +5269,8 @@
         <w:t xml:space="preserve">would remove that fragility.</w:t>
       </w:r>
     </w:p>
-    <w:bookmarkEnd w:id="33"/>
-    <w:bookmarkStart w:id="34" w:name="sending-is-synchronous"/>
+    <w:bookmarkEnd w:id="34"/>
+    <w:bookmarkStart w:id="35" w:name="sending-is-synchronous"/>
     <w:p>
       <w:pPr>
         <w:pStyle w:val="Heading3"/>
@@ -4733,9 +5306,9 @@
         </w:pict>
       </w:r>
     </w:p>
-    <w:bookmarkEnd w:id="34"/>
     <w:bookmarkEnd w:id="35"/>
-    <w:bookmarkStart w:id="36" w:name="migration"/>
+    <w:bookmarkEnd w:id="36"/>
+    <w:bookmarkStart w:id="37" w:name="migration"/>
     <w:p>
       <w:pPr>
         <w:pStyle w:val="Heading2"/>
@@ -4845,8 +5418,8 @@
         </w:pict>
       </w:r>
     </w:p>
-    <w:bookmarkEnd w:id="36"/>
-    <w:bookmarkStart w:id="37" w:name="recommendation"/>
+    <w:bookmarkEnd w:id="37"/>
+    <w:bookmarkStart w:id="38" w:name="recommendation"/>
     <w:p>
       <w:pPr>
         <w:pStyle w:val="Heading2"/>
@@ -4944,8 +5517,8 @@
         <w:t xml:space="preserve">can be validated with genuine recipients.</w:t>
       </w:r>
     </w:p>
-    <w:bookmarkEnd w:id="37"/>
     <w:bookmarkEnd w:id="38"/>
+    <w:bookmarkEnd w:id="39"/>
     <w:sectPr/>
   </w:body>
 </w:document>

</xml_diff>